<commit_message>
Sincronización automática Carora — 2026-02-23 19:41:11
</commit_message>
<xml_diff>
--- a/Manual_Arranque_Carora.docx
+++ b/Manual_Arranque_Carora.docx
@@ -164,12 +164,6 @@
         <w:gridCol w:w="3120"/>
       </w:tblGrid>
       <w:tr>
-        <w:tblPrEx>
-          <w:tblCellMar>
-            <w:top w:w="0" w:type="dxa"/>
-            <w:bottom w:w="0" w:type="dxa"/>
-          </w:tblCellMar>
-        </w:tblPrEx>
         <w:tc>
           <w:tcPr>
             <w:tcW w:w="3120" w:type="dxa"/>
@@ -271,12 +265,6 @@
         </w:tc>
       </w:tr>
       <w:tr>
-        <w:tblPrEx>
-          <w:tblCellMar>
-            <w:top w:w="0" w:type="dxa"/>
-            <w:bottom w:w="0" w:type="dxa"/>
-          </w:tblCellMar>
-        </w:tblPrEx>
         <w:tc>
           <w:tcPr>
             <w:tcW w:w="3120" w:type="dxa"/>
@@ -363,12 +351,6 @@
         </w:tc>
       </w:tr>
       <w:tr>
-        <w:tblPrEx>
-          <w:tblCellMar>
-            <w:top w:w="0" w:type="dxa"/>
-            <w:bottom w:w="0" w:type="dxa"/>
-          </w:tblCellMar>
-        </w:tblPrEx>
         <w:tc>
           <w:tcPr>
             <w:tcW w:w="3120" w:type="dxa"/>
@@ -473,12 +455,6 @@
         </w:tc>
       </w:tr>
       <w:tr>
-        <w:tblPrEx>
-          <w:tblCellMar>
-            <w:top w:w="0" w:type="dxa"/>
-            <w:bottom w:w="0" w:type="dxa"/>
-          </w:tblCellMar>
-        </w:tblPrEx>
         <w:tc>
           <w:tcPr>
             <w:tcW w:w="3120" w:type="dxa"/>
@@ -585,12 +561,6 @@
         </w:tc>
       </w:tr>
       <w:tr>
-        <w:tblPrEx>
-          <w:tblCellMar>
-            <w:top w:w="0" w:type="dxa"/>
-            <w:bottom w:w="0" w:type="dxa"/>
-          </w:tblCellMar>
-        </w:tblPrEx>
         <w:tc>
           <w:tcPr>
             <w:tcW w:w="3120" w:type="dxa"/>
@@ -778,12 +748,6 @@
         <w:gridCol w:w="9360"/>
       </w:tblGrid>
       <w:tr>
-        <w:tblPrEx>
-          <w:tblCellMar>
-            <w:top w:w="0" w:type="dxa"/>
-            <w:bottom w:w="0" w:type="dxa"/>
-          </w:tblCellMar>
-        </w:tblPrEx>
         <w:tc>
           <w:tcPr>
             <w:tcW w:w="0" w:type="auto"/>
@@ -817,12 +781,6 @@
         </w:tc>
       </w:tr>
       <w:tr>
-        <w:tblPrEx>
-          <w:tblCellMar>
-            <w:top w:w="0" w:type="dxa"/>
-            <w:bottom w:w="0" w:type="dxa"/>
-          </w:tblCellMar>
-        </w:tblPrEx>
         <w:tc>
           <w:tcPr>
             <w:tcW w:w="0" w:type="auto"/>
@@ -854,12 +812,9 @@
         </w:tc>
       </w:tr>
       <w:tr>
-        <w:tblPrEx>
-          <w:tblCellMar>
-            <w:top w:w="0" w:type="dxa"/>
-            <w:bottom w:w="0" w:type="dxa"/>
-          </w:tblCellMar>
-        </w:tblPrEx>
+        <w:trPr>
+          <w:trHeight w:val="45"/>
+        </w:trPr>
         <w:tc>
           <w:tcPr>
             <w:tcW w:w="0" w:type="auto"/>
@@ -891,12 +846,6 @@
         </w:tc>
       </w:tr>
       <w:tr>
-        <w:tblPrEx>
-          <w:tblCellMar>
-            <w:top w:w="0" w:type="dxa"/>
-            <w:bottom w:w="0" w:type="dxa"/>
-          </w:tblCellMar>
-        </w:tblPrEx>
         <w:tc>
           <w:tcPr>
             <w:tcW w:w="0" w:type="auto"/>
@@ -918,12 +867,6 @@
         </w:tc>
       </w:tr>
       <w:tr>
-        <w:tblPrEx>
-          <w:tblCellMar>
-            <w:top w:w="0" w:type="dxa"/>
-            <w:bottom w:w="0" w:type="dxa"/>
-          </w:tblCellMar>
-        </w:tblPrEx>
         <w:tc>
           <w:tcPr>
             <w:tcW w:w="0" w:type="auto"/>
@@ -955,12 +898,6 @@
         </w:tc>
       </w:tr>
       <w:tr>
-        <w:tblPrEx>
-          <w:tblCellMar>
-            <w:top w:w="0" w:type="dxa"/>
-            <w:bottom w:w="0" w:type="dxa"/>
-          </w:tblCellMar>
-        </w:tblPrEx>
         <w:tc>
           <w:tcPr>
             <w:tcW w:w="0" w:type="auto"/>
@@ -1004,12 +941,6 @@
         </w:tc>
       </w:tr>
       <w:tr>
-        <w:tblPrEx>
-          <w:tblCellMar>
-            <w:top w:w="0" w:type="dxa"/>
-            <w:bottom w:w="0" w:type="dxa"/>
-          </w:tblCellMar>
-        </w:tblPrEx>
         <w:tc>
           <w:tcPr>
             <w:tcW w:w="0" w:type="auto"/>
@@ -1031,12 +962,6 @@
         </w:tc>
       </w:tr>
       <w:tr>
-        <w:tblPrEx>
-          <w:tblCellMar>
-            <w:top w:w="0" w:type="dxa"/>
-            <w:bottom w:w="0" w:type="dxa"/>
-          </w:tblCellMar>
-        </w:tblPrEx>
         <w:tc>
           <w:tcPr>
             <w:tcW w:w="0" w:type="auto"/>
@@ -1068,12 +993,6 @@
         </w:tc>
       </w:tr>
       <w:tr>
-        <w:tblPrEx>
-          <w:tblCellMar>
-            <w:top w:w="0" w:type="dxa"/>
-            <w:bottom w:w="0" w:type="dxa"/>
-          </w:tblCellMar>
-        </w:tblPrEx>
         <w:tc>
           <w:tcPr>
             <w:tcW w:w="0" w:type="auto"/>
@@ -1193,12 +1112,6 @@
         <w:gridCol w:w="9360"/>
       </w:tblGrid>
       <w:tr>
-        <w:tblPrEx>
-          <w:tblCellMar>
-            <w:top w:w="0" w:type="dxa"/>
-            <w:bottom w:w="0" w:type="dxa"/>
-          </w:tblCellMar>
-        </w:tblPrEx>
         <w:tc>
           <w:tcPr>
             <w:tcW w:w="0" w:type="auto"/>
@@ -1232,12 +1145,6 @@
         </w:tc>
       </w:tr>
       <w:tr>
-        <w:tblPrEx>
-          <w:tblCellMar>
-            <w:top w:w="0" w:type="dxa"/>
-            <w:bottom w:w="0" w:type="dxa"/>
-          </w:tblCellMar>
-        </w:tblPrEx>
         <w:tc>
           <w:tcPr>
             <w:tcW w:w="0" w:type="auto"/>
@@ -1269,12 +1176,6 @@
         </w:tc>
       </w:tr>
       <w:tr>
-        <w:tblPrEx>
-          <w:tblCellMar>
-            <w:top w:w="0" w:type="dxa"/>
-            <w:bottom w:w="0" w:type="dxa"/>
-          </w:tblCellMar>
-        </w:tblPrEx>
         <w:tc>
           <w:tcPr>
             <w:tcW w:w="0" w:type="auto"/>
@@ -1337,12 +1238,6 @@
         </w:tc>
       </w:tr>
       <w:tr>
-        <w:tblPrEx>
-          <w:tblCellMar>
-            <w:top w:w="0" w:type="dxa"/>
-            <w:bottom w:w="0" w:type="dxa"/>
-          </w:tblCellMar>
-        </w:tblPrEx>
         <w:tc>
           <w:tcPr>
             <w:tcW w:w="0" w:type="auto"/>
@@ -1374,12 +1269,6 @@
         </w:tc>
       </w:tr>
       <w:tr>
-        <w:tblPrEx>
-          <w:tblCellMar>
-            <w:top w:w="0" w:type="dxa"/>
-            <w:bottom w:w="0" w:type="dxa"/>
-          </w:tblCellMar>
-        </w:tblPrEx>
         <w:tc>
           <w:tcPr>
             <w:tcW w:w="0" w:type="auto"/>
@@ -1507,12 +1396,6 @@
         <w:gridCol w:w="9360"/>
       </w:tblGrid>
       <w:tr>
-        <w:tblPrEx>
-          <w:tblCellMar>
-            <w:top w:w="0" w:type="dxa"/>
-            <w:bottom w:w="0" w:type="dxa"/>
-          </w:tblCellMar>
-        </w:tblPrEx>
         <w:tc>
           <w:tcPr>
             <w:tcW w:w="0" w:type="auto"/>
@@ -1546,12 +1429,6 @@
         </w:tc>
       </w:tr>
       <w:tr>
-        <w:tblPrEx>
-          <w:tblCellMar>
-            <w:top w:w="0" w:type="dxa"/>
-            <w:bottom w:w="0" w:type="dxa"/>
-          </w:tblCellMar>
-        </w:tblPrEx>
         <w:tc>
           <w:tcPr>
             <w:tcW w:w="0" w:type="auto"/>
@@ -1583,12 +1460,6 @@
         </w:tc>
       </w:tr>
       <w:tr>
-        <w:tblPrEx>
-          <w:tblCellMar>
-            <w:top w:w="0" w:type="dxa"/>
-            <w:bottom w:w="0" w:type="dxa"/>
-          </w:tblCellMar>
-        </w:tblPrEx>
         <w:tc>
           <w:tcPr>
             <w:tcW w:w="0" w:type="auto"/>
@@ -1657,12 +1528,6 @@
         <w:gridCol w:w="9360"/>
       </w:tblGrid>
       <w:tr>
-        <w:tblPrEx>
-          <w:tblCellMar>
-            <w:top w:w="0" w:type="dxa"/>
-            <w:bottom w:w="0" w:type="dxa"/>
-          </w:tblCellMar>
-        </w:tblPrEx>
         <w:tc>
           <w:tcPr>
             <w:tcW w:w="0" w:type="auto"/>
@@ -1696,12 +1561,6 @@
         </w:tc>
       </w:tr>
       <w:tr>
-        <w:tblPrEx>
-          <w:tblCellMar>
-            <w:top w:w="0" w:type="dxa"/>
-            <w:bottom w:w="0" w:type="dxa"/>
-          </w:tblCellMar>
-        </w:tblPrEx>
         <w:tc>
           <w:tcPr>
             <w:tcW w:w="0" w:type="auto"/>
@@ -1733,12 +1592,6 @@
         </w:tc>
       </w:tr>
       <w:tr>
-        <w:tblPrEx>
-          <w:tblCellMar>
-            <w:top w:w="0" w:type="dxa"/>
-            <w:bottom w:w="0" w:type="dxa"/>
-          </w:tblCellMar>
-        </w:tblPrEx>
         <w:tc>
           <w:tcPr>
             <w:tcW w:w="0" w:type="auto"/>
@@ -1843,12 +1696,6 @@
         <w:gridCol w:w="9360"/>
       </w:tblGrid>
       <w:tr>
-        <w:tblPrEx>
-          <w:tblCellMar>
-            <w:top w:w="0" w:type="dxa"/>
-            <w:bottom w:w="0" w:type="dxa"/>
-          </w:tblCellMar>
-        </w:tblPrEx>
         <w:tc>
           <w:tcPr>
             <w:tcW w:w="0" w:type="auto"/>
@@ -1882,12 +1729,6 @@
         </w:tc>
       </w:tr>
       <w:tr>
-        <w:tblPrEx>
-          <w:tblCellMar>
-            <w:top w:w="0" w:type="dxa"/>
-            <w:bottom w:w="0" w:type="dxa"/>
-          </w:tblCellMar>
-        </w:tblPrEx>
         <w:tc>
           <w:tcPr>
             <w:tcW w:w="0" w:type="auto"/>
@@ -1930,12 +1771,6 @@
         </w:tc>
       </w:tr>
       <w:tr>
-        <w:tblPrEx>
-          <w:tblCellMar>
-            <w:top w:w="0" w:type="dxa"/>
-            <w:bottom w:w="0" w:type="dxa"/>
-          </w:tblCellMar>
-        </w:tblPrEx>
         <w:tc>
           <w:tcPr>
             <w:tcW w:w="0" w:type="auto"/>
@@ -1987,12 +1822,6 @@
         </w:tc>
       </w:tr>
       <w:tr>
-        <w:tblPrEx>
-          <w:tblCellMar>
-            <w:top w:w="0" w:type="dxa"/>
-            <w:bottom w:w="0" w:type="dxa"/>
-          </w:tblCellMar>
-        </w:tblPrEx>
         <w:tc>
           <w:tcPr>
             <w:tcW w:w="0" w:type="auto"/>
@@ -2014,12 +1843,6 @@
         </w:tc>
       </w:tr>
       <w:tr>
-        <w:tblPrEx>
-          <w:tblCellMar>
-            <w:top w:w="0" w:type="dxa"/>
-            <w:bottom w:w="0" w:type="dxa"/>
-          </w:tblCellMar>
-        </w:tblPrEx>
         <w:tc>
           <w:tcPr>
             <w:tcW w:w="0" w:type="auto"/>
@@ -2051,12 +1874,6 @@
         </w:tc>
       </w:tr>
       <w:tr>
-        <w:tblPrEx>
-          <w:tblCellMar>
-            <w:top w:w="0" w:type="dxa"/>
-            <w:bottom w:w="0" w:type="dxa"/>
-          </w:tblCellMar>
-        </w:tblPrEx>
         <w:tc>
           <w:tcPr>
             <w:tcW w:w="0" w:type="auto"/>
@@ -2147,12 +1964,6 @@
         <w:gridCol w:w="9360"/>
       </w:tblGrid>
       <w:tr>
-        <w:tblPrEx>
-          <w:tblCellMar>
-            <w:top w:w="0" w:type="dxa"/>
-            <w:bottom w:w="0" w:type="dxa"/>
-          </w:tblCellMar>
-        </w:tblPrEx>
         <w:tc>
           <w:tcPr>
             <w:tcW w:w="0" w:type="auto"/>
@@ -2186,12 +1997,6 @@
         </w:tc>
       </w:tr>
       <w:tr>
-        <w:tblPrEx>
-          <w:tblCellMar>
-            <w:top w:w="0" w:type="dxa"/>
-            <w:bottom w:w="0" w:type="dxa"/>
-          </w:tblCellMar>
-        </w:tblPrEx>
         <w:tc>
           <w:tcPr>
             <w:tcW w:w="0" w:type="auto"/>
@@ -2263,12 +2068,6 @@
         </w:tc>
       </w:tr>
       <w:tr>
-        <w:tblPrEx>
-          <w:tblCellMar>
-            <w:top w:w="0" w:type="dxa"/>
-            <w:bottom w:w="0" w:type="dxa"/>
-          </w:tblCellMar>
-        </w:tblPrEx>
         <w:tc>
           <w:tcPr>
             <w:tcW w:w="0" w:type="auto"/>
@@ -2290,12 +2089,6 @@
         </w:tc>
       </w:tr>
       <w:tr>
-        <w:tblPrEx>
-          <w:tblCellMar>
-            <w:top w:w="0" w:type="dxa"/>
-            <w:bottom w:w="0" w:type="dxa"/>
-          </w:tblCellMar>
-        </w:tblPrEx>
         <w:tc>
           <w:tcPr>
             <w:tcW w:w="0" w:type="auto"/>
@@ -2347,12 +2140,6 @@
         </w:tc>
       </w:tr>
       <w:tr>
-        <w:tblPrEx>
-          <w:tblCellMar>
-            <w:top w:w="0" w:type="dxa"/>
-            <w:bottom w:w="0" w:type="dxa"/>
-          </w:tblCellMar>
-        </w:tblPrEx>
         <w:tc>
           <w:tcPr>
             <w:tcW w:w="0" w:type="auto"/>
@@ -2480,12 +2267,6 @@
         <w:gridCol w:w="9360"/>
       </w:tblGrid>
       <w:tr>
-        <w:tblPrEx>
-          <w:tblCellMar>
-            <w:top w:w="0" w:type="dxa"/>
-            <w:bottom w:w="0" w:type="dxa"/>
-          </w:tblCellMar>
-        </w:tblPrEx>
         <w:tc>
           <w:tcPr>
             <w:tcW w:w="0" w:type="auto"/>
@@ -2519,12 +2300,6 @@
         </w:tc>
       </w:tr>
       <w:tr>
-        <w:tblPrEx>
-          <w:tblCellMar>
-            <w:top w:w="0" w:type="dxa"/>
-            <w:bottom w:w="0" w:type="dxa"/>
-          </w:tblCellMar>
-        </w:tblPrEx>
         <w:tc>
           <w:tcPr>
             <w:tcW w:w="0" w:type="auto"/>
@@ -2576,12 +2351,6 @@
         </w:tc>
       </w:tr>
       <w:tr>
-        <w:tblPrEx>
-          <w:tblCellMar>
-            <w:top w:w="0" w:type="dxa"/>
-            <w:bottom w:w="0" w:type="dxa"/>
-          </w:tblCellMar>
-        </w:tblPrEx>
         <w:tc>
           <w:tcPr>
             <w:tcW w:w="0" w:type="auto"/>
@@ -2694,12 +2463,6 @@
         <w:gridCol w:w="9360"/>
       </w:tblGrid>
       <w:tr>
-        <w:tblPrEx>
-          <w:tblCellMar>
-            <w:top w:w="0" w:type="dxa"/>
-            <w:bottom w:w="0" w:type="dxa"/>
-          </w:tblCellMar>
-        </w:tblPrEx>
         <w:tc>
           <w:tcPr>
             <w:tcW w:w="0" w:type="auto"/>
@@ -2733,12 +2496,6 @@
         </w:tc>
       </w:tr>
       <w:tr>
-        <w:tblPrEx>
-          <w:tblCellMar>
-            <w:top w:w="0" w:type="dxa"/>
-            <w:bottom w:w="0" w:type="dxa"/>
-          </w:tblCellMar>
-        </w:tblPrEx>
         <w:tc>
           <w:tcPr>
             <w:tcW w:w="0" w:type="auto"/>
@@ -2870,12 +2627,6 @@
         </w:tc>
       </w:tr>
       <w:tr>
-        <w:tblPrEx>
-          <w:tblCellMar>
-            <w:top w:w="0" w:type="dxa"/>
-            <w:bottom w:w="0" w:type="dxa"/>
-          </w:tblCellMar>
-        </w:tblPrEx>
         <w:tc>
           <w:tcPr>
             <w:tcW w:w="0" w:type="auto"/>
@@ -2998,12 +2749,6 @@
         </w:tc>
       </w:tr>
       <w:tr>
-        <w:tblPrEx>
-          <w:tblCellMar>
-            <w:top w:w="0" w:type="dxa"/>
-            <w:bottom w:w="0" w:type="dxa"/>
-          </w:tblCellMar>
-        </w:tblPrEx>
         <w:tc>
           <w:tcPr>
             <w:tcW w:w="0" w:type="auto"/>
@@ -3075,12 +2820,6 @@
         </w:tc>
       </w:tr>
       <w:tr>
-        <w:tblPrEx>
-          <w:tblCellMar>
-            <w:top w:w="0" w:type="dxa"/>
-            <w:bottom w:w="0" w:type="dxa"/>
-          </w:tblCellMar>
-        </w:tblPrEx>
         <w:tc>
           <w:tcPr>
             <w:tcW w:w="0" w:type="auto"/>
@@ -3152,12 +2891,6 @@
         </w:tc>
       </w:tr>
       <w:tr>
-        <w:tblPrEx>
-          <w:tblCellMar>
-            <w:top w:w="0" w:type="dxa"/>
-            <w:bottom w:w="0" w:type="dxa"/>
-          </w:tblCellMar>
-        </w:tblPrEx>
         <w:tc>
           <w:tcPr>
             <w:tcW w:w="0" w:type="auto"/>
@@ -3235,12 +2968,6 @@
         <w:gridCol w:w="9360"/>
       </w:tblGrid>
       <w:tr>
-        <w:tblPrEx>
-          <w:tblCellMar>
-            <w:top w:w="0" w:type="dxa"/>
-            <w:bottom w:w="0" w:type="dxa"/>
-          </w:tblCellMar>
-        </w:tblPrEx>
         <w:tc>
           <w:tcPr>
             <w:tcW w:w="0" w:type="auto"/>
@@ -3274,12 +3001,6 @@
         </w:tc>
       </w:tr>
       <w:tr>
-        <w:tblPrEx>
-          <w:tblCellMar>
-            <w:top w:w="0" w:type="dxa"/>
-            <w:bottom w:w="0" w:type="dxa"/>
-          </w:tblCellMar>
-        </w:tblPrEx>
         <w:tc>
           <w:tcPr>
             <w:tcW w:w="0" w:type="auto"/>
@@ -3311,12 +3032,6 @@
         </w:tc>
       </w:tr>
       <w:tr>
-        <w:tblPrEx>
-          <w:tblCellMar>
-            <w:top w:w="0" w:type="dxa"/>
-            <w:bottom w:w="0" w:type="dxa"/>
-          </w:tblCellMar>
-        </w:tblPrEx>
         <w:tc>
           <w:tcPr>
             <w:tcW w:w="0" w:type="auto"/>
@@ -3348,12 +3063,6 @@
         </w:tc>
       </w:tr>
       <w:tr>
-        <w:tblPrEx>
-          <w:tblCellMar>
-            <w:top w:w="0" w:type="dxa"/>
-            <w:bottom w:w="0" w:type="dxa"/>
-          </w:tblCellMar>
-        </w:tblPrEx>
         <w:tc>
           <w:tcPr>
             <w:tcW w:w="0" w:type="auto"/>
@@ -3483,12 +3192,6 @@
         <w:gridCol w:w="9360"/>
       </w:tblGrid>
       <w:tr>
-        <w:tblPrEx>
-          <w:tblCellMar>
-            <w:top w:w="0" w:type="dxa"/>
-            <w:bottom w:w="0" w:type="dxa"/>
-          </w:tblCellMar>
-        </w:tblPrEx>
         <w:tc>
           <w:tcPr>
             <w:tcW w:w="0" w:type="auto"/>
@@ -3522,12 +3225,6 @@
         </w:tc>
       </w:tr>
       <w:tr>
-        <w:tblPrEx>
-          <w:tblCellMar>
-            <w:top w:w="0" w:type="dxa"/>
-            <w:bottom w:w="0" w:type="dxa"/>
-          </w:tblCellMar>
-        </w:tblPrEx>
         <w:tc>
           <w:tcPr>
             <w:tcW w:w="0" w:type="auto"/>
@@ -3570,12 +3267,6 @@
         </w:tc>
       </w:tr>
       <w:tr>
-        <w:tblPrEx>
-          <w:tblCellMar>
-            <w:top w:w="0" w:type="dxa"/>
-            <w:bottom w:w="0" w:type="dxa"/>
-          </w:tblCellMar>
-        </w:tblPrEx>
         <w:tc>
           <w:tcPr>
             <w:tcW w:w="0" w:type="auto"/>
@@ -3627,12 +3318,6 @@
         </w:tc>
       </w:tr>
       <w:tr>
-        <w:tblPrEx>
-          <w:tblCellMar>
-            <w:top w:w="0" w:type="dxa"/>
-            <w:bottom w:w="0" w:type="dxa"/>
-          </w:tblCellMar>
-        </w:tblPrEx>
         <w:tc>
           <w:tcPr>
             <w:tcW w:w="0" w:type="auto"/>
@@ -3654,12 +3339,6 @@
         </w:tc>
       </w:tr>
       <w:tr>
-        <w:tblPrEx>
-          <w:tblCellMar>
-            <w:top w:w="0" w:type="dxa"/>
-            <w:bottom w:w="0" w:type="dxa"/>
-          </w:tblCellMar>
-        </w:tblPrEx>
         <w:tc>
           <w:tcPr>
             <w:tcW w:w="0" w:type="auto"/>
@@ -3691,12 +3370,6 @@
         </w:tc>
       </w:tr>
       <w:tr>
-        <w:tblPrEx>
-          <w:tblCellMar>
-            <w:top w:w="0" w:type="dxa"/>
-            <w:bottom w:w="0" w:type="dxa"/>
-          </w:tblCellMar>
-        </w:tblPrEx>
         <w:tc>
           <w:tcPr>
             <w:tcW w:w="0" w:type="auto"/>
@@ -3793,10 +3466,7 @@
       </w:r>
       <w:proofErr w:type="spellEnd"/>
       <w:r>
-        <w:t>' se ejecuta aut</w:t>
-      </w:r>
-      <w:r>
-        <w:t>omáticamente cada 15 minutos. Para verificar que funciona:</w:t>
+        <w:t>' se ejecuta automáticamente cada 15 minutos. Para verificar que funciona:</w:t>
       </w:r>
     </w:p>
     <w:p>
@@ -3825,12 +3495,6 @@
         <w:gridCol w:w="9360"/>
       </w:tblGrid>
       <w:tr>
-        <w:tblPrEx>
-          <w:tblCellMar>
-            <w:top w:w="0" w:type="dxa"/>
-            <w:bottom w:w="0" w:type="dxa"/>
-          </w:tblCellMar>
-        </w:tblPrEx>
         <w:tc>
           <w:tcPr>
             <w:tcW w:w="0" w:type="auto"/>
@@ -3864,12 +3528,6 @@
         </w:tc>
       </w:tr>
       <w:tr>
-        <w:tblPrEx>
-          <w:tblCellMar>
-            <w:top w:w="0" w:type="dxa"/>
-            <w:bottom w:w="0" w:type="dxa"/>
-          </w:tblCellMar>
-        </w:tblPrEx>
         <w:tc>
           <w:tcPr>
             <w:tcW w:w="0" w:type="auto"/>
@@ -3901,12 +3559,6 @@
         </w:tc>
       </w:tr>
       <w:tr>
-        <w:tblPrEx>
-          <w:tblCellMar>
-            <w:top w:w="0" w:type="dxa"/>
-            <w:bottom w:w="0" w:type="dxa"/>
-          </w:tblCellMar>
-        </w:tblPrEx>
         <w:tc>
           <w:tcPr>
             <w:tcW w:w="0" w:type="auto"/>
@@ -4048,12 +3700,6 @@
         <w:gridCol w:w="9360"/>
       </w:tblGrid>
       <w:tr>
-        <w:tblPrEx>
-          <w:tblCellMar>
-            <w:top w:w="0" w:type="dxa"/>
-            <w:bottom w:w="0" w:type="dxa"/>
-          </w:tblCellMar>
-        </w:tblPrEx>
         <w:tc>
           <w:tcPr>
             <w:tcW w:w="0" w:type="auto"/>
@@ -4087,12 +3733,6 @@
         </w:tc>
       </w:tr>
       <w:tr>
-        <w:tblPrEx>
-          <w:tblCellMar>
-            <w:top w:w="0" w:type="dxa"/>
-            <w:bottom w:w="0" w:type="dxa"/>
-          </w:tblCellMar>
-        </w:tblPrEx>
         <w:tc>
           <w:tcPr>
             <w:tcW w:w="0" w:type="auto"/>
@@ -4124,12 +3764,6 @@
         </w:tc>
       </w:tr>
       <w:tr>
-        <w:tblPrEx>
-          <w:tblCellMar>
-            <w:top w:w="0" w:type="dxa"/>
-            <w:bottom w:w="0" w:type="dxa"/>
-          </w:tblCellMar>
-        </w:tblPrEx>
         <w:tc>
           <w:tcPr>
             <w:tcW w:w="0" w:type="auto"/>
@@ -4161,12 +3795,6 @@
         </w:tc>
       </w:tr>
       <w:tr>
-        <w:tblPrEx>
-          <w:tblCellMar>
-            <w:top w:w="0" w:type="dxa"/>
-            <w:bottom w:w="0" w:type="dxa"/>
-          </w:tblCellMar>
-        </w:tblPrEx>
         <w:tc>
           <w:tcPr>
             <w:tcW w:w="0" w:type="auto"/>
@@ -4237,12 +3865,6 @@
         <w:gridCol w:w="9360"/>
       </w:tblGrid>
       <w:tr>
-        <w:tblPrEx>
-          <w:tblCellMar>
-            <w:top w:w="0" w:type="dxa"/>
-            <w:bottom w:w="0" w:type="dxa"/>
-          </w:tblCellMar>
-        </w:tblPrEx>
         <w:tc>
           <w:tcPr>
             <w:tcW w:w="0" w:type="auto"/>
@@ -4276,12 +3898,6 @@
         </w:tc>
       </w:tr>
       <w:tr>
-        <w:tblPrEx>
-          <w:tblCellMar>
-            <w:top w:w="0" w:type="dxa"/>
-            <w:bottom w:w="0" w:type="dxa"/>
-          </w:tblCellMar>
-        </w:tblPrEx>
         <w:tc>
           <w:tcPr>
             <w:tcW w:w="0" w:type="auto"/>
@@ -4313,12 +3929,6 @@
         </w:tc>
       </w:tr>
       <w:tr>
-        <w:tblPrEx>
-          <w:tblCellMar>
-            <w:top w:w="0" w:type="dxa"/>
-            <w:bottom w:w="0" w:type="dxa"/>
-          </w:tblCellMar>
-        </w:tblPrEx>
         <w:tc>
           <w:tcPr>
             <w:tcW w:w="0" w:type="auto"/>
@@ -4350,12 +3960,6 @@
         </w:tc>
       </w:tr>
       <w:tr>
-        <w:tblPrEx>
-          <w:tblCellMar>
-            <w:top w:w="0" w:type="dxa"/>
-            <w:bottom w:w="0" w:type="dxa"/>
-          </w:tblCellMar>
-        </w:tblPrEx>
         <w:tc>
           <w:tcPr>
             <w:tcW w:w="0" w:type="auto"/>
@@ -4451,12 +4055,6 @@
         <w:gridCol w:w="8560"/>
       </w:tblGrid>
       <w:tr>
-        <w:tblPrEx>
-          <w:tblCellMar>
-            <w:top w:w="0" w:type="dxa"/>
-            <w:bottom w:w="0" w:type="dxa"/>
-          </w:tblCellMar>
-        </w:tblPrEx>
         <w:tc>
           <w:tcPr>
             <w:tcW w:w="800" w:type="dxa"/>
@@ -4562,12 +4160,6 @@
         </w:tc>
       </w:tr>
       <w:tr>
-        <w:tblPrEx>
-          <w:tblCellMar>
-            <w:top w:w="0" w:type="dxa"/>
-            <w:bottom w:w="0" w:type="dxa"/>
-          </w:tblCellMar>
-        </w:tblPrEx>
         <w:tc>
           <w:tcPr>
             <w:tcW w:w="800" w:type="dxa"/>
@@ -4663,12 +4255,6 @@
         </w:tc>
       </w:tr>
       <w:tr>
-        <w:tblPrEx>
-          <w:tblCellMar>
-            <w:top w:w="0" w:type="dxa"/>
-            <w:bottom w:w="0" w:type="dxa"/>
-          </w:tblCellMar>
-        </w:tblPrEx>
         <w:tc>
           <w:tcPr>
             <w:tcW w:w="800" w:type="dxa"/>
@@ -4756,12 +4342,6 @@
         </w:tc>
       </w:tr>
       <w:tr>
-        <w:tblPrEx>
-          <w:tblCellMar>
-            <w:top w:w="0" w:type="dxa"/>
-            <w:bottom w:w="0" w:type="dxa"/>
-          </w:tblCellMar>
-        </w:tblPrEx>
         <w:tc>
           <w:tcPr>
             <w:tcW w:w="800" w:type="dxa"/>
@@ -4839,12 +4419,6 @@
         </w:tc>
       </w:tr>
       <w:tr>
-        <w:tblPrEx>
-          <w:tblCellMar>
-            <w:top w:w="0" w:type="dxa"/>
-            <w:bottom w:w="0" w:type="dxa"/>
-          </w:tblCellMar>
-        </w:tblPrEx>
         <w:tc>
           <w:tcPr>
             <w:tcW w:w="800" w:type="dxa"/>
@@ -5093,12 +4667,6 @@
         <w:gridCol w:w="9360"/>
       </w:tblGrid>
       <w:tr>
-        <w:tblPrEx>
-          <w:tblCellMar>
-            <w:top w:w="0" w:type="dxa"/>
-            <w:bottom w:w="0" w:type="dxa"/>
-          </w:tblCellMar>
-        </w:tblPrEx>
         <w:tc>
           <w:tcPr>
             <w:tcW w:w="0" w:type="auto"/>
@@ -5132,12 +4700,6 @@
         </w:tc>
       </w:tr>
       <w:tr>
-        <w:tblPrEx>
-          <w:tblCellMar>
-            <w:top w:w="0" w:type="dxa"/>
-            <w:bottom w:w="0" w:type="dxa"/>
-          </w:tblCellMar>
-        </w:tblPrEx>
         <w:tc>
           <w:tcPr>
             <w:tcW w:w="0" w:type="auto"/>
@@ -5169,12 +4731,6 @@
         </w:tc>
       </w:tr>
       <w:tr>
-        <w:tblPrEx>
-          <w:tblCellMar>
-            <w:top w:w="0" w:type="dxa"/>
-            <w:bottom w:w="0" w:type="dxa"/>
-          </w:tblCellMar>
-        </w:tblPrEx>
         <w:tc>
           <w:tcPr>
             <w:tcW w:w="0" w:type="auto"/>
@@ -5196,12 +4752,6 @@
         </w:tc>
       </w:tr>
       <w:tr>
-        <w:tblPrEx>
-          <w:tblCellMar>
-            <w:top w:w="0" w:type="dxa"/>
-            <w:bottom w:w="0" w:type="dxa"/>
-          </w:tblCellMar>
-        </w:tblPrEx>
         <w:tc>
           <w:tcPr>
             <w:tcW w:w="0" w:type="auto"/>
@@ -5233,12 +4783,6 @@
         </w:tc>
       </w:tr>
       <w:tr>
-        <w:tblPrEx>
-          <w:tblCellMar>
-            <w:top w:w="0" w:type="dxa"/>
-            <w:bottom w:w="0" w:type="dxa"/>
-          </w:tblCellMar>
-        </w:tblPrEx>
         <w:tc>
           <w:tcPr>
             <w:tcW w:w="0" w:type="auto"/>
@@ -5281,12 +4825,6 @@
         </w:tc>
       </w:tr>
       <w:tr>
-        <w:tblPrEx>
-          <w:tblCellMar>
-            <w:top w:w="0" w:type="dxa"/>
-            <w:bottom w:w="0" w:type="dxa"/>
-          </w:tblCellMar>
-        </w:tblPrEx>
         <w:tc>
           <w:tcPr>
             <w:tcW w:w="0" w:type="auto"/>
@@ -5308,12 +4846,6 @@
         </w:tc>
       </w:tr>
       <w:tr>
-        <w:tblPrEx>
-          <w:tblCellMar>
-            <w:top w:w="0" w:type="dxa"/>
-            <w:bottom w:w="0" w:type="dxa"/>
-          </w:tblCellMar>
-        </w:tblPrEx>
         <w:tc>
           <w:tcPr>
             <w:tcW w:w="0" w:type="auto"/>
@@ -5345,12 +4877,6 @@
         </w:tc>
       </w:tr>
       <w:tr>
-        <w:tblPrEx>
-          <w:tblCellMar>
-            <w:top w:w="0" w:type="dxa"/>
-            <w:bottom w:w="0" w:type="dxa"/>
-          </w:tblCellMar>
-        </w:tblPrEx>
         <w:tc>
           <w:tcPr>
             <w:tcW w:w="0" w:type="auto"/>
@@ -5415,12 +4941,6 @@
         </w:tc>
       </w:tr>
       <w:tr>
-        <w:tblPrEx>
-          <w:tblCellMar>
-            <w:top w:w="0" w:type="dxa"/>
-            <w:bottom w:w="0" w:type="dxa"/>
-          </w:tblCellMar>
-        </w:tblPrEx>
         <w:tc>
           <w:tcPr>
             <w:tcW w:w="0" w:type="auto"/>
@@ -5442,12 +4962,6 @@
         </w:tc>
       </w:tr>
       <w:tr>
-        <w:tblPrEx>
-          <w:tblCellMar>
-            <w:top w:w="0" w:type="dxa"/>
-            <w:bottom w:w="0" w:type="dxa"/>
-          </w:tblCellMar>
-        </w:tblPrEx>
         <w:tc>
           <w:tcPr>
             <w:tcW w:w="0" w:type="auto"/>
@@ -5479,12 +4993,6 @@
         </w:tc>
       </w:tr>
       <w:tr>
-        <w:tblPrEx>
-          <w:tblCellMar>
-            <w:top w:w="0" w:type="dxa"/>
-            <w:bottom w:w="0" w:type="dxa"/>
-          </w:tblCellMar>
-        </w:tblPrEx>
         <w:tc>
           <w:tcPr>
             <w:tcW w:w="0" w:type="auto"/>
@@ -5567,12 +5075,6 @@
         </w:tc>
       </w:tr>
       <w:tr>
-        <w:tblPrEx>
-          <w:tblCellMar>
-            <w:top w:w="0" w:type="dxa"/>
-            <w:bottom w:w="0" w:type="dxa"/>
-          </w:tblCellMar>
-        </w:tblPrEx>
         <w:tc>
           <w:tcPr>
             <w:tcW w:w="0" w:type="auto"/>
@@ -5594,12 +5096,6 @@
         </w:tc>
       </w:tr>
       <w:tr>
-        <w:tblPrEx>
-          <w:tblCellMar>
-            <w:top w:w="0" w:type="dxa"/>
-            <w:bottom w:w="0" w:type="dxa"/>
-          </w:tblCellMar>
-        </w:tblPrEx>
         <w:tc>
           <w:tcPr>
             <w:tcW w:w="0" w:type="auto"/>
@@ -5631,12 +5127,6 @@
         </w:tc>
       </w:tr>
       <w:tr>
-        <w:tblPrEx>
-          <w:tblCellMar>
-            <w:top w:w="0" w:type="dxa"/>
-            <w:bottom w:w="0" w:type="dxa"/>
-          </w:tblCellMar>
-        </w:tblPrEx>
         <w:tc>
           <w:tcPr>
             <w:tcW w:w="0" w:type="auto"/>
@@ -5756,12 +5246,6 @@
         <w:gridCol w:w="9360"/>
       </w:tblGrid>
       <w:tr>
-        <w:tblPrEx>
-          <w:tblCellMar>
-            <w:top w:w="0" w:type="dxa"/>
-            <w:bottom w:w="0" w:type="dxa"/>
-          </w:tblCellMar>
-        </w:tblPrEx>
         <w:tc>
           <w:tcPr>
             <w:tcW w:w="0" w:type="auto"/>
@@ -5795,12 +5279,6 @@
         </w:tc>
       </w:tr>
       <w:tr>
-        <w:tblPrEx>
-          <w:tblCellMar>
-            <w:top w:w="0" w:type="dxa"/>
-            <w:bottom w:w="0" w:type="dxa"/>
-          </w:tblCellMar>
-        </w:tblPrEx>
         <w:tc>
           <w:tcPr>
             <w:tcW w:w="0" w:type="auto"/>
@@ -5852,12 +5330,6 @@
         </w:tc>
       </w:tr>
       <w:tr>
-        <w:tblPrEx>
-          <w:tblCellMar>
-            <w:top w:w="0" w:type="dxa"/>
-            <w:bottom w:w="0" w:type="dxa"/>
-          </w:tblCellMar>
-        </w:tblPrEx>
         <w:tc>
           <w:tcPr>
             <w:tcW w:w="0" w:type="auto"/>
@@ -5960,12 +5432,6 @@
         </w:tc>
       </w:tr>
       <w:tr>
-        <w:tblPrEx>
-          <w:tblCellMar>
-            <w:top w:w="0" w:type="dxa"/>
-            <w:bottom w:w="0" w:type="dxa"/>
-          </w:tblCellMar>
-        </w:tblPrEx>
         <w:tc>
           <w:tcPr>
             <w:tcW w:w="0" w:type="auto"/>
@@ -6088,12 +5554,6 @@
         </w:tc>
       </w:tr>
       <w:tr>
-        <w:tblPrEx>
-          <w:tblCellMar>
-            <w:top w:w="0" w:type="dxa"/>
-            <w:bottom w:w="0" w:type="dxa"/>
-          </w:tblCellMar>
-        </w:tblPrEx>
         <w:tc>
           <w:tcPr>
             <w:tcW w:w="0" w:type="auto"/>
@@ -6223,12 +5683,6 @@
         <w:gridCol w:w="9360"/>
       </w:tblGrid>
       <w:tr>
-        <w:tblPrEx>
-          <w:tblCellMar>
-            <w:top w:w="0" w:type="dxa"/>
-            <w:bottom w:w="0" w:type="dxa"/>
-          </w:tblCellMar>
-        </w:tblPrEx>
         <w:tc>
           <w:tcPr>
             <w:tcW w:w="0" w:type="auto"/>
@@ -6262,12 +5716,6 @@
         </w:tc>
       </w:tr>
       <w:tr>
-        <w:tblPrEx>
-          <w:tblCellMar>
-            <w:top w:w="0" w:type="dxa"/>
-            <w:bottom w:w="0" w:type="dxa"/>
-          </w:tblCellMar>
-        </w:tblPrEx>
         <w:tc>
           <w:tcPr>
             <w:tcW w:w="0" w:type="auto"/>
@@ -6299,12 +5747,6 @@
         </w:tc>
       </w:tr>
       <w:tr>
-        <w:tblPrEx>
-          <w:tblCellMar>
-            <w:top w:w="0" w:type="dxa"/>
-            <w:bottom w:w="0" w:type="dxa"/>
-          </w:tblCellMar>
-        </w:tblPrEx>
         <w:tc>
           <w:tcPr>
             <w:tcW w:w="0" w:type="auto"/>
@@ -6421,12 +5863,6 @@
         <w:gridCol w:w="9360"/>
       </w:tblGrid>
       <w:tr>
-        <w:tblPrEx>
-          <w:tblCellMar>
-            <w:top w:w="0" w:type="dxa"/>
-            <w:bottom w:w="0" w:type="dxa"/>
-          </w:tblCellMar>
-        </w:tblPrEx>
         <w:tc>
           <w:tcPr>
             <w:tcW w:w="0" w:type="auto"/>
@@ -6460,12 +5896,6 @@
         </w:tc>
       </w:tr>
       <w:tr>
-        <w:tblPrEx>
-          <w:tblCellMar>
-            <w:top w:w="0" w:type="dxa"/>
-            <w:bottom w:w="0" w:type="dxa"/>
-          </w:tblCellMar>
-        </w:tblPrEx>
         <w:tc>
           <w:tcPr>
             <w:tcW w:w="0" w:type="auto"/>
@@ -6497,12 +5927,6 @@
         </w:tc>
       </w:tr>
       <w:tr>
-        <w:tblPrEx>
-          <w:tblCellMar>
-            <w:top w:w="0" w:type="dxa"/>
-            <w:bottom w:w="0" w:type="dxa"/>
-          </w:tblCellMar>
-        </w:tblPrEx>
         <w:tc>
           <w:tcPr>
             <w:tcW w:w="0" w:type="auto"/>
@@ -6545,12 +5969,6 @@
         </w:tc>
       </w:tr>
       <w:tr>
-        <w:tblPrEx>
-          <w:tblCellMar>
-            <w:top w:w="0" w:type="dxa"/>
-            <w:bottom w:w="0" w:type="dxa"/>
-          </w:tblCellMar>
-        </w:tblPrEx>
         <w:tc>
           <w:tcPr>
             <w:tcW w:w="0" w:type="auto"/>
@@ -6665,12 +6083,6 @@
         <w:gridCol w:w="9360"/>
       </w:tblGrid>
       <w:tr>
-        <w:tblPrEx>
-          <w:tblCellMar>
-            <w:top w:w="0" w:type="dxa"/>
-            <w:bottom w:w="0" w:type="dxa"/>
-          </w:tblCellMar>
-        </w:tblPrEx>
         <w:tc>
           <w:tcPr>
             <w:tcW w:w="0" w:type="auto"/>
@@ -6704,12 +6116,6 @@
         </w:tc>
       </w:tr>
       <w:tr>
-        <w:tblPrEx>
-          <w:tblCellMar>
-            <w:top w:w="0" w:type="dxa"/>
-            <w:bottom w:w="0" w:type="dxa"/>
-          </w:tblCellMar>
-        </w:tblPrEx>
         <w:tc>
           <w:tcPr>
             <w:tcW w:w="0" w:type="auto"/>
@@ -6741,12 +6147,6 @@
         </w:tc>
       </w:tr>
       <w:tr>
-        <w:tblPrEx>
-          <w:tblCellMar>
-            <w:top w:w="0" w:type="dxa"/>
-            <w:bottom w:w="0" w:type="dxa"/>
-          </w:tblCellMar>
-        </w:tblPrEx>
         <w:tc>
           <w:tcPr>
             <w:tcW w:w="0" w:type="auto"/>
@@ -6798,12 +6198,6 @@
         </w:tc>
       </w:tr>
       <w:tr>
-        <w:tblPrEx>
-          <w:tblCellMar>
-            <w:top w:w="0" w:type="dxa"/>
-            <w:bottom w:w="0" w:type="dxa"/>
-          </w:tblCellMar>
-        </w:tblPrEx>
         <w:tc>
           <w:tcPr>
             <w:tcW w:w="0" w:type="auto"/>
@@ -6918,12 +6312,6 @@
         <w:gridCol w:w="9360"/>
       </w:tblGrid>
       <w:tr>
-        <w:tblPrEx>
-          <w:tblCellMar>
-            <w:top w:w="0" w:type="dxa"/>
-            <w:bottom w:w="0" w:type="dxa"/>
-          </w:tblCellMar>
-        </w:tblPrEx>
         <w:tc>
           <w:tcPr>
             <w:tcW w:w="0" w:type="auto"/>
@@ -6957,12 +6345,6 @@
         </w:tc>
       </w:tr>
       <w:tr>
-        <w:tblPrEx>
-          <w:tblCellMar>
-            <w:top w:w="0" w:type="dxa"/>
-            <w:bottom w:w="0" w:type="dxa"/>
-          </w:tblCellMar>
-        </w:tblPrEx>
         <w:tc>
           <w:tcPr>
             <w:tcW w:w="0" w:type="auto"/>
@@ -7014,12 +6396,6 @@
         </w:tc>
       </w:tr>
       <w:tr>
-        <w:tblPrEx>
-          <w:tblCellMar>
-            <w:top w:w="0" w:type="dxa"/>
-            <w:bottom w:w="0" w:type="dxa"/>
-          </w:tblCellMar>
-        </w:tblPrEx>
         <w:tc>
           <w:tcPr>
             <w:tcW w:w="0" w:type="auto"/>
@@ -7071,12 +6447,6 @@
         </w:tc>
       </w:tr>
       <w:tr>
-        <w:tblPrEx>
-          <w:tblCellMar>
-            <w:top w:w="0" w:type="dxa"/>
-            <w:bottom w:w="0" w:type="dxa"/>
-          </w:tblCellMar>
-        </w:tblPrEx>
         <w:tc>
           <w:tcPr>
             <w:tcW w:w="0" w:type="auto"/>
@@ -7193,12 +6563,6 @@
         <w:gridCol w:w="9360"/>
       </w:tblGrid>
       <w:tr>
-        <w:tblPrEx>
-          <w:tblCellMar>
-            <w:top w:w="0" w:type="dxa"/>
-            <w:bottom w:w="0" w:type="dxa"/>
-          </w:tblCellMar>
-        </w:tblPrEx>
         <w:tc>
           <w:tcPr>
             <w:tcW w:w="0" w:type="auto"/>
@@ -7232,12 +6596,6 @@
         </w:tc>
       </w:tr>
       <w:tr>
-        <w:tblPrEx>
-          <w:tblCellMar>
-            <w:top w:w="0" w:type="dxa"/>
-            <w:bottom w:w="0" w:type="dxa"/>
-          </w:tblCellMar>
-        </w:tblPrEx>
         <w:tc>
           <w:tcPr>
             <w:tcW w:w="0" w:type="auto"/>
@@ -7269,12 +6627,6 @@
         </w:tc>
       </w:tr>
       <w:tr>
-        <w:tblPrEx>
-          <w:tblCellMar>
-            <w:top w:w="0" w:type="dxa"/>
-            <w:bottom w:w="0" w:type="dxa"/>
-          </w:tblCellMar>
-        </w:tblPrEx>
         <w:tc>
           <w:tcPr>
             <w:tcW w:w="0" w:type="auto"/>
@@ -7306,12 +6658,6 @@
         </w:tc>
       </w:tr>
       <w:tr>
-        <w:tblPrEx>
-          <w:tblCellMar>
-            <w:top w:w="0" w:type="dxa"/>
-            <w:bottom w:w="0" w:type="dxa"/>
-          </w:tblCellMar>
-        </w:tblPrEx>
         <w:tc>
           <w:tcPr>
             <w:tcW w:w="0" w:type="auto"/>
@@ -7374,12 +6720,6 @@
         </w:tc>
       </w:tr>
       <w:tr>
-        <w:tblPrEx>
-          <w:tblCellMar>
-            <w:top w:w="0" w:type="dxa"/>
-            <w:bottom w:w="0" w:type="dxa"/>
-          </w:tblCellMar>
-        </w:tblPrEx>
         <w:tc>
           <w:tcPr>
             <w:tcW w:w="0" w:type="auto"/>
@@ -7506,12 +6846,6 @@
         <w:gridCol w:w="9360"/>
       </w:tblGrid>
       <w:tr>
-        <w:tblPrEx>
-          <w:tblCellMar>
-            <w:top w:w="0" w:type="dxa"/>
-            <w:bottom w:w="0" w:type="dxa"/>
-          </w:tblCellMar>
-        </w:tblPrEx>
         <w:tc>
           <w:tcPr>
             <w:tcW w:w="0" w:type="auto"/>
@@ -7545,12 +6879,6 @@
         </w:tc>
       </w:tr>
       <w:tr>
-        <w:tblPrEx>
-          <w:tblCellMar>
-            <w:top w:w="0" w:type="dxa"/>
-            <w:bottom w:w="0" w:type="dxa"/>
-          </w:tblCellMar>
-        </w:tblPrEx>
         <w:tc>
           <w:tcPr>
             <w:tcW w:w="0" w:type="auto"/>
@@ -7602,12 +6930,6 @@
         </w:tc>
       </w:tr>
       <w:tr>
-        <w:tblPrEx>
-          <w:tblCellMar>
-            <w:top w:w="0" w:type="dxa"/>
-            <w:bottom w:w="0" w:type="dxa"/>
-          </w:tblCellMar>
-        </w:tblPrEx>
         <w:tc>
           <w:tcPr>
             <w:tcW w:w="0" w:type="auto"/>
@@ -7659,12 +6981,6 @@
         </w:tc>
       </w:tr>
       <w:tr>
-        <w:tblPrEx>
-          <w:tblCellMar>
-            <w:top w:w="0" w:type="dxa"/>
-            <w:bottom w:w="0" w:type="dxa"/>
-          </w:tblCellMar>
-        </w:tblPrEx>
         <w:tc>
           <w:tcPr>
             <w:tcW w:w="0" w:type="auto"/>
@@ -7736,12 +7052,6 @@
         </w:tc>
       </w:tr>
       <w:tr>
-        <w:tblPrEx>
-          <w:tblCellMar>
-            <w:top w:w="0" w:type="dxa"/>
-            <w:bottom w:w="0" w:type="dxa"/>
-          </w:tblCellMar>
-        </w:tblPrEx>
         <w:tc>
           <w:tcPr>
             <w:tcW w:w="0" w:type="auto"/>
@@ -7793,12 +7103,6 @@
         </w:tc>
       </w:tr>
       <w:tr>
-        <w:tblPrEx>
-          <w:tblCellMar>
-            <w:top w:w="0" w:type="dxa"/>
-            <w:bottom w:w="0" w:type="dxa"/>
-          </w:tblCellMar>
-        </w:tblPrEx>
         <w:tc>
           <w:tcPr>
             <w:tcW w:w="0" w:type="auto"/>
@@ -7921,12 +7225,6 @@
         <w:gridCol w:w="9360"/>
       </w:tblGrid>
       <w:tr>
-        <w:tblPrEx>
-          <w:tblCellMar>
-            <w:top w:w="0" w:type="dxa"/>
-            <w:bottom w:w="0" w:type="dxa"/>
-          </w:tblCellMar>
-        </w:tblPrEx>
         <w:tc>
           <w:tcPr>
             <w:tcW w:w="0" w:type="auto"/>
@@ -7960,12 +7258,6 @@
         </w:tc>
       </w:tr>
       <w:tr>
-        <w:tblPrEx>
-          <w:tblCellMar>
-            <w:top w:w="0" w:type="dxa"/>
-            <w:bottom w:w="0" w:type="dxa"/>
-          </w:tblCellMar>
-        </w:tblPrEx>
         <w:tc>
           <w:tcPr>
             <w:tcW w:w="0" w:type="auto"/>
@@ -7997,12 +7289,6 @@
         </w:tc>
       </w:tr>
       <w:tr>
-        <w:tblPrEx>
-          <w:tblCellMar>
-            <w:top w:w="0" w:type="dxa"/>
-            <w:bottom w:w="0" w:type="dxa"/>
-          </w:tblCellMar>
-        </w:tblPrEx>
         <w:tc>
           <w:tcPr>
             <w:tcW w:w="0" w:type="auto"/>
@@ -8024,12 +7310,6 @@
         </w:tc>
       </w:tr>
       <w:tr>
-        <w:tblPrEx>
-          <w:tblCellMar>
-            <w:top w:w="0" w:type="dxa"/>
-            <w:bottom w:w="0" w:type="dxa"/>
-          </w:tblCellMar>
-        </w:tblPrEx>
         <w:tc>
           <w:tcPr>
             <w:tcW w:w="0" w:type="auto"/>
@@ -8061,12 +7341,6 @@
         </w:tc>
       </w:tr>
       <w:tr>
-        <w:tblPrEx>
-          <w:tblCellMar>
-            <w:top w:w="0" w:type="dxa"/>
-            <w:bottom w:w="0" w:type="dxa"/>
-          </w:tblCellMar>
-        </w:tblPrEx>
         <w:tc>
           <w:tcPr>
             <w:tcW w:w="0" w:type="auto"/>
@@ -8098,12 +7372,6 @@
         </w:tc>
       </w:tr>
       <w:tr>
-        <w:tblPrEx>
-          <w:tblCellMar>
-            <w:top w:w="0" w:type="dxa"/>
-            <w:bottom w:w="0" w:type="dxa"/>
-          </w:tblCellMar>
-        </w:tblPrEx>
         <w:tc>
           <w:tcPr>
             <w:tcW w:w="0" w:type="auto"/>
@@ -8197,12 +7465,6 @@
         </w:tc>
       </w:tr>
       <w:tr>
-        <w:tblPrEx>
-          <w:tblCellMar>
-            <w:top w:w="0" w:type="dxa"/>
-            <w:bottom w:w="0" w:type="dxa"/>
-          </w:tblCellMar>
-        </w:tblPrEx>
         <w:tc>
           <w:tcPr>
             <w:tcW w:w="0" w:type="auto"/>
@@ -8224,12 +7486,6 @@
         </w:tc>
       </w:tr>
       <w:tr>
-        <w:tblPrEx>
-          <w:tblCellMar>
-            <w:top w:w="0" w:type="dxa"/>
-            <w:bottom w:w="0" w:type="dxa"/>
-          </w:tblCellMar>
-        </w:tblPrEx>
         <w:tc>
           <w:tcPr>
             <w:tcW w:w="0" w:type="auto"/>
@@ -8261,12 +7517,6 @@
         </w:tc>
       </w:tr>
       <w:tr>
-        <w:tblPrEx>
-          <w:tblCellMar>
-            <w:top w:w="0" w:type="dxa"/>
-            <w:bottom w:w="0" w:type="dxa"/>
-          </w:tblCellMar>
-        </w:tblPrEx>
         <w:tc>
           <w:tcPr>
             <w:tcW w:w="0" w:type="auto"/>
@@ -8311,12 +7561,6 @@
         </w:tc>
       </w:tr>
       <w:tr>
-        <w:tblPrEx>
-          <w:tblCellMar>
-            <w:top w:w="0" w:type="dxa"/>
-            <w:bottom w:w="0" w:type="dxa"/>
-          </w:tblCellMar>
-        </w:tblPrEx>
         <w:tc>
           <w:tcPr>
             <w:tcW w:w="0" w:type="auto"/>
@@ -8338,12 +7582,6 @@
         </w:tc>
       </w:tr>
       <w:tr>
-        <w:tblPrEx>
-          <w:tblCellMar>
-            <w:top w:w="0" w:type="dxa"/>
-            <w:bottom w:w="0" w:type="dxa"/>
-          </w:tblCellMar>
-        </w:tblPrEx>
         <w:tc>
           <w:tcPr>
             <w:tcW w:w="0" w:type="auto"/>
@@ -8375,12 +7613,6 @@
         </w:tc>
       </w:tr>
       <w:tr>
-        <w:tblPrEx>
-          <w:tblCellMar>
-            <w:top w:w="0" w:type="dxa"/>
-            <w:bottom w:w="0" w:type="dxa"/>
-          </w:tblCellMar>
-        </w:tblPrEx>
         <w:tc>
           <w:tcPr>
             <w:tcW w:w="0" w:type="auto"/>
@@ -8432,12 +7664,6 @@
         </w:tc>
       </w:tr>
       <w:tr>
-        <w:tblPrEx>
-          <w:tblCellMar>
-            <w:top w:w="0" w:type="dxa"/>
-            <w:bottom w:w="0" w:type="dxa"/>
-          </w:tblCellMar>
-        </w:tblPrEx>
         <w:tc>
           <w:tcPr>
             <w:tcW w:w="0" w:type="auto"/>
@@ -8489,12 +7715,6 @@
         </w:tc>
       </w:tr>
       <w:tr>
-        <w:tblPrEx>
-          <w:tblCellMar>
-            <w:top w:w="0" w:type="dxa"/>
-            <w:bottom w:w="0" w:type="dxa"/>
-          </w:tblCellMar>
-        </w:tblPrEx>
         <w:tc>
           <w:tcPr>
             <w:tcW w:w="0" w:type="auto"/>
@@ -8516,12 +7736,6 @@
         </w:tc>
       </w:tr>
       <w:tr>
-        <w:tblPrEx>
-          <w:tblCellMar>
-            <w:top w:w="0" w:type="dxa"/>
-            <w:bottom w:w="0" w:type="dxa"/>
-          </w:tblCellMar>
-        </w:tblPrEx>
         <w:tc>
           <w:tcPr>
             <w:tcW w:w="0" w:type="auto"/>
@@ -8564,12 +7778,6 @@
         </w:tc>
       </w:tr>
       <w:tr>
-        <w:tblPrEx>
-          <w:tblCellMar>
-            <w:top w:w="0" w:type="dxa"/>
-            <w:bottom w:w="0" w:type="dxa"/>
-          </w:tblCellMar>
-        </w:tblPrEx>
         <w:tc>
           <w:tcPr>
             <w:tcW w:w="0" w:type="auto"/>
@@ -8643,12 +7851,6 @@
         </w:tc>
       </w:tr>
       <w:tr>
-        <w:tblPrEx>
-          <w:tblCellMar>
-            <w:top w:w="0" w:type="dxa"/>
-            <w:bottom w:w="0" w:type="dxa"/>
-          </w:tblCellMar>
-        </w:tblPrEx>
         <w:tc>
           <w:tcPr>
             <w:tcW w:w="0" w:type="auto"/>
@@ -8670,12 +7872,6 @@
         </w:tc>
       </w:tr>
       <w:tr>
-        <w:tblPrEx>
-          <w:tblCellMar>
-            <w:top w:w="0" w:type="dxa"/>
-            <w:bottom w:w="0" w:type="dxa"/>
-          </w:tblCellMar>
-        </w:tblPrEx>
         <w:tc>
           <w:tcPr>
             <w:tcW w:w="0" w:type="auto"/>
@@ -8727,12 +7923,6 @@
         </w:tc>
       </w:tr>
       <w:tr>
-        <w:tblPrEx>
-          <w:tblCellMar>
-            <w:top w:w="0" w:type="dxa"/>
-            <w:bottom w:w="0" w:type="dxa"/>
-          </w:tblCellMar>
-        </w:tblPrEx>
         <w:tc>
           <w:tcPr>
             <w:tcW w:w="0" w:type="auto"/>
@@ -8784,12 +7974,6 @@
         </w:tc>
       </w:tr>
       <w:tr>
-        <w:tblPrEx>
-          <w:tblCellMar>
-            <w:top w:w="0" w:type="dxa"/>
-            <w:bottom w:w="0" w:type="dxa"/>
-          </w:tblCellMar>
-        </w:tblPrEx>
         <w:tc>
           <w:tcPr>
             <w:tcW w:w="0" w:type="auto"/>
@@ -8821,12 +8005,6 @@
         </w:tc>
       </w:tr>
       <w:tr>
-        <w:tblPrEx>
-          <w:tblCellMar>
-            <w:top w:w="0" w:type="dxa"/>
-            <w:bottom w:w="0" w:type="dxa"/>
-          </w:tblCellMar>
-        </w:tblPrEx>
         <w:tc>
           <w:tcPr>
             <w:tcW w:w="0" w:type="auto"/>
@@ -8848,12 +8026,6 @@
         </w:tc>
       </w:tr>
       <w:tr>
-        <w:tblPrEx>
-          <w:tblCellMar>
-            <w:top w:w="0" w:type="dxa"/>
-            <w:bottom w:w="0" w:type="dxa"/>
-          </w:tblCellMar>
-        </w:tblPrEx>
         <w:tc>
           <w:tcPr>
             <w:tcW w:w="0" w:type="auto"/>
@@ -8911,12 +8083,6 @@
         <w:gridCol w:w="9360"/>
       </w:tblGrid>
       <w:tr>
-        <w:tblPrEx>
-          <w:tblCellMar>
-            <w:top w:w="0" w:type="dxa"/>
-            <w:bottom w:w="0" w:type="dxa"/>
-          </w:tblCellMar>
-        </w:tblPrEx>
         <w:tc>
           <w:tcPr>
             <w:tcW w:w="0" w:type="auto"/>
@@ -8950,12 +8116,6 @@
         </w:tc>
       </w:tr>
       <w:tr>
-        <w:tblPrEx>
-          <w:tblCellMar>
-            <w:top w:w="0" w:type="dxa"/>
-            <w:bottom w:w="0" w:type="dxa"/>
-          </w:tblCellMar>
-        </w:tblPrEx>
         <w:tc>
           <w:tcPr>
             <w:tcW w:w="0" w:type="auto"/>
@@ -8987,12 +8147,6 @@
         </w:tc>
       </w:tr>
       <w:tr>
-        <w:tblPrEx>
-          <w:tblCellMar>
-            <w:top w:w="0" w:type="dxa"/>
-            <w:bottom w:w="0" w:type="dxa"/>
-          </w:tblCellMar>
-        </w:tblPrEx>
         <w:tc>
           <w:tcPr>
             <w:tcW w:w="0" w:type="auto"/>
@@ -9014,12 +8168,6 @@
         </w:tc>
       </w:tr>
       <w:tr>
-        <w:tblPrEx>
-          <w:tblCellMar>
-            <w:top w:w="0" w:type="dxa"/>
-            <w:bottom w:w="0" w:type="dxa"/>
-          </w:tblCellMar>
-        </w:tblPrEx>
         <w:tc>
           <w:tcPr>
             <w:tcW w:w="0" w:type="auto"/>
@@ -9051,12 +8199,6 @@
         </w:tc>
       </w:tr>
       <w:tr>
-        <w:tblPrEx>
-          <w:tblCellMar>
-            <w:top w:w="0" w:type="dxa"/>
-            <w:bottom w:w="0" w:type="dxa"/>
-          </w:tblCellMar>
-        </w:tblPrEx>
         <w:tc>
           <w:tcPr>
             <w:tcW w:w="0" w:type="auto"/>
@@ -9121,12 +8263,6 @@
         </w:tc>
       </w:tr>
       <w:tr>
-        <w:tblPrEx>
-          <w:tblCellMar>
-            <w:top w:w="0" w:type="dxa"/>
-            <w:bottom w:w="0" w:type="dxa"/>
-          </w:tblCellMar>
-        </w:tblPrEx>
         <w:tc>
           <w:tcPr>
             <w:tcW w:w="0" w:type="auto"/>
@@ -9229,12 +8365,6 @@
         </w:tc>
       </w:tr>
       <w:tr>
-        <w:tblPrEx>
-          <w:tblCellMar>
-            <w:top w:w="0" w:type="dxa"/>
-            <w:bottom w:w="0" w:type="dxa"/>
-          </w:tblCellMar>
-        </w:tblPrEx>
         <w:tc>
           <w:tcPr>
             <w:tcW w:w="0" w:type="auto"/>
@@ -9328,12 +8458,6 @@
         </w:tc>
       </w:tr>
       <w:tr>
-        <w:tblPrEx>
-          <w:tblCellMar>
-            <w:top w:w="0" w:type="dxa"/>
-            <w:bottom w:w="0" w:type="dxa"/>
-          </w:tblCellMar>
-        </w:tblPrEx>
         <w:tc>
           <w:tcPr>
             <w:tcW w:w="0" w:type="auto"/>
@@ -9355,12 +8479,6 @@
         </w:tc>
       </w:tr>
       <w:tr>
-        <w:tblPrEx>
-          <w:tblCellMar>
-            <w:top w:w="0" w:type="dxa"/>
-            <w:bottom w:w="0" w:type="dxa"/>
-          </w:tblCellMar>
-        </w:tblPrEx>
         <w:tc>
           <w:tcPr>
             <w:tcW w:w="0" w:type="auto"/>
@@ -9392,12 +8510,6 @@
         </w:tc>
       </w:tr>
       <w:tr>
-        <w:tblPrEx>
-          <w:tblCellMar>
-            <w:top w:w="0" w:type="dxa"/>
-            <w:bottom w:w="0" w:type="dxa"/>
-          </w:tblCellMar>
-        </w:tblPrEx>
         <w:tc>
           <w:tcPr>
             <w:tcW w:w="0" w:type="auto"/>
@@ -9419,12 +8531,6 @@
         </w:tc>
       </w:tr>
       <w:tr>
-        <w:tblPrEx>
-          <w:tblCellMar>
-            <w:top w:w="0" w:type="dxa"/>
-            <w:bottom w:w="0" w:type="dxa"/>
-          </w:tblCellMar>
-        </w:tblPrEx>
         <w:tc>
           <w:tcPr>
             <w:tcW w:w="0" w:type="auto"/>
@@ -9513,12 +8619,6 @@
         <w:gridCol w:w="3120"/>
       </w:tblGrid>
       <w:tr>
-        <w:tblPrEx>
-          <w:tblCellMar>
-            <w:top w:w="0" w:type="dxa"/>
-            <w:bottom w:w="0" w:type="dxa"/>
-          </w:tblCellMar>
-        </w:tblPrEx>
         <w:tc>
           <w:tcPr>
             <w:tcW w:w="3120" w:type="dxa"/>
@@ -9621,12 +8721,6 @@
         </w:tc>
       </w:tr>
       <w:tr>
-        <w:tblPrEx>
-          <w:tblCellMar>
-            <w:top w:w="0" w:type="dxa"/>
-            <w:bottom w:w="0" w:type="dxa"/>
-          </w:tblCellMar>
-        </w:tblPrEx>
         <w:tc>
           <w:tcPr>
             <w:tcW w:w="3120" w:type="dxa"/>
@@ -9723,12 +8817,6 @@
         </w:tc>
       </w:tr>
       <w:tr>
-        <w:tblPrEx>
-          <w:tblCellMar>
-            <w:top w:w="0" w:type="dxa"/>
-            <w:bottom w:w="0" w:type="dxa"/>
-          </w:tblCellMar>
-        </w:tblPrEx>
         <w:tc>
           <w:tcPr>
             <w:tcW w:w="3120" w:type="dxa"/>
@@ -9825,12 +8913,6 @@
         </w:tc>
       </w:tr>
       <w:tr>
-        <w:tblPrEx>
-          <w:tblCellMar>
-            <w:top w:w="0" w:type="dxa"/>
-            <w:bottom w:w="0" w:type="dxa"/>
-          </w:tblCellMar>
-        </w:tblPrEx>
         <w:tc>
           <w:tcPr>
             <w:tcW w:w="3120" w:type="dxa"/>
@@ -9937,12 +9019,6 @@
         </w:tc>
       </w:tr>
       <w:tr>
-        <w:tblPrEx>
-          <w:tblCellMar>
-            <w:top w:w="0" w:type="dxa"/>
-            <w:bottom w:w="0" w:type="dxa"/>
-          </w:tblCellMar>
-        </w:tblPrEx>
         <w:tc>
           <w:tcPr>
             <w:tcW w:w="3120" w:type="dxa"/>
@@ -10067,12 +9143,6 @@
         </w:tc>
       </w:tr>
       <w:tr>
-        <w:tblPrEx>
-          <w:tblCellMar>
-            <w:top w:w="0" w:type="dxa"/>
-            <w:bottom w:w="0" w:type="dxa"/>
-          </w:tblCellMar>
-        </w:tblPrEx>
         <w:tc>
           <w:tcPr>
             <w:tcW w:w="3120" w:type="dxa"/>
@@ -10187,12 +9257,6 @@
         </w:tc>
       </w:tr>
       <w:tr>
-        <w:tblPrEx>
-          <w:tblCellMar>
-            <w:top w:w="0" w:type="dxa"/>
-            <w:bottom w:w="0" w:type="dxa"/>
-          </w:tblCellMar>
-        </w:tblPrEx>
         <w:tc>
           <w:tcPr>
             <w:tcW w:w="3120" w:type="dxa"/>
@@ -10297,12 +9361,6 @@
         </w:tc>
       </w:tr>
       <w:tr>
-        <w:tblPrEx>
-          <w:tblCellMar>
-            <w:top w:w="0" w:type="dxa"/>
-            <w:bottom w:w="0" w:type="dxa"/>
-          </w:tblCellMar>
-        </w:tblPrEx>
         <w:tc>
           <w:tcPr>
             <w:tcW w:w="3120" w:type="dxa"/>

</xml_diff>